<commit_message>
[TUAN03] add: observer pattern for stock and task notification
</commit_message>
<xml_diff>
--- a/22660241_NguyenTrungHau_Tuan03/DesignPatterns_Tuan03_22660241_NguyenTrungHau/MinhChung_KTTKPM_Tuan03_22660241_NguyenTrungHau.docx
+++ b/22660241_NguyenTrungHau_Tuan03/DesignPatterns_Tuan03_22660241_NguyenTrungHau/MinhChung_KTTKPM_Tuan03_22660241_NguyenTrungHau.docx
@@ -263,10 +263,6 @@
     <w:p>
       <w:pPr>
         <w:jc w:val="both"/>
-        <w:rPr>
-          <w:rFonts w:hint="default"/>
-          <w:lang w:val="en-US"/>
-        </w:rPr>
       </w:pPr>
       <w:r>
         <w:drawing>
@@ -296,6 +292,265 @@
                     <a:xfrm>
                       <a:off x="0" y="0"/>
                       <a:ext cx="5262245" cy="2800350"/>
+                    </a:xfrm>
+                    <a:prstGeom prst="rect">
+                      <a:avLst/>
+                    </a:prstGeom>
+                    <a:noFill/>
+                    <a:ln>
+                      <a:noFill/>
+                    </a:ln>
+                  </pic:spPr>
+                </pic:pic>
+              </a:graphicData>
+            </a:graphic>
+          </wp:inline>
+        </w:drawing>
+      </w:r>
+    </w:p>
+    <w:p>
+      <w:pPr>
+        <w:jc w:val="both"/>
+      </w:pPr>
+    </w:p>
+    <w:p>
+      <w:pPr>
+        <w:jc w:val="both"/>
+        <w:rPr>
+          <w:rFonts w:hint="default" w:ascii="Times New Roman" w:hAnsi="Times New Roman" w:cs="Times New Roman"/>
+          <w:sz w:val="26"/>
+          <w:szCs w:val="26"/>
+          <w:lang w:val="en-US"/>
+        </w:rPr>
+      </w:pPr>
+      <w:r>
+        <w:rPr>
+          <w:rFonts w:hint="default" w:ascii="Times New Roman" w:hAnsi="Times New Roman" w:cs="Times New Roman"/>
+          <w:sz w:val="26"/>
+          <w:szCs w:val="26"/>
+          <w:lang w:val="en-US"/>
+        </w:rPr>
+        <w:t>Observer Pattern:</w:t>
+      </w:r>
+      <w:r>
+        <w:rPr>
+          <w:rFonts w:hint="default" w:ascii="Times New Roman" w:hAnsi="Times New Roman" w:cs="Times New Roman"/>
+          <w:sz w:val="26"/>
+          <w:szCs w:val="26"/>
+          <w:lang w:val="en-US"/>
+        </w:rPr>
+        <w:br w:type="textWrapping"/>
+      </w:r>
+      <w:r>
+        <w:rPr>
+          <w:rFonts w:hint="default" w:ascii="Times New Roman" w:hAnsi="Times New Roman" w:cs="Times New Roman"/>
+          <w:sz w:val="26"/>
+          <w:szCs w:val="26"/>
+          <w:lang w:val="en-US"/>
+        </w:rPr>
+        <w:t>Bài toán 1:</w:t>
+      </w:r>
+    </w:p>
+    <w:p>
+      <w:pPr>
+        <w:jc w:val="both"/>
+      </w:pPr>
+      <w:r>
+        <w:drawing>
+          <wp:inline distT="0" distB="0" distL="114300" distR="114300">
+            <wp:extent cx="3421380" cy="5669280"/>
+            <wp:effectExtent l="0" t="0" r="7620" b="0"/>
+            <wp:docPr id="5" name="Picture 4"/>
+            <wp:cNvGraphicFramePr>
+              <a:graphicFrameLocks xmlns:a="http://schemas.openxmlformats.org/drawingml/2006/main" noChangeAspect="1"/>
+            </wp:cNvGraphicFramePr>
+            <a:graphic xmlns:a="http://schemas.openxmlformats.org/drawingml/2006/main">
+              <a:graphicData uri="http://schemas.openxmlformats.org/drawingml/2006/picture">
+                <pic:pic xmlns:pic="http://schemas.openxmlformats.org/drawingml/2006/picture">
+                  <pic:nvPicPr>
+                    <pic:cNvPr id="5" name="Picture 4"/>
+                    <pic:cNvPicPr>
+                      <a:picLocks noChangeAspect="1"/>
+                    </pic:cNvPicPr>
+                  </pic:nvPicPr>
+                  <pic:blipFill>
+                    <a:blip r:embed="rId8"/>
+                    <a:stretch>
+                      <a:fillRect/>
+                    </a:stretch>
+                  </pic:blipFill>
+                  <pic:spPr>
+                    <a:xfrm>
+                      <a:off x="0" y="0"/>
+                      <a:ext cx="3421380" cy="5669280"/>
+                    </a:xfrm>
+                    <a:prstGeom prst="rect">
+                      <a:avLst/>
+                    </a:prstGeom>
+                    <a:noFill/>
+                    <a:ln>
+                      <a:noFill/>
+                    </a:ln>
+                  </pic:spPr>
+                </pic:pic>
+              </a:graphicData>
+            </a:graphic>
+          </wp:inline>
+        </w:drawing>
+      </w:r>
+    </w:p>
+    <w:p>
+      <w:pPr>
+        <w:jc w:val="both"/>
+      </w:pPr>
+      <w:r>
+        <w:drawing>
+          <wp:inline distT="0" distB="0" distL="114300" distR="114300">
+            <wp:extent cx="5267960" cy="2808605"/>
+            <wp:effectExtent l="0" t="0" r="5080" b="10795"/>
+            <wp:docPr id="7" name="Picture 6"/>
+            <wp:cNvGraphicFramePr>
+              <a:graphicFrameLocks xmlns:a="http://schemas.openxmlformats.org/drawingml/2006/main" noChangeAspect="1"/>
+            </wp:cNvGraphicFramePr>
+            <a:graphic xmlns:a="http://schemas.openxmlformats.org/drawingml/2006/main">
+              <a:graphicData uri="http://schemas.openxmlformats.org/drawingml/2006/picture">
+                <pic:pic xmlns:pic="http://schemas.openxmlformats.org/drawingml/2006/picture">
+                  <pic:nvPicPr>
+                    <pic:cNvPr id="7" name="Picture 6"/>
+                    <pic:cNvPicPr>
+                      <a:picLocks noChangeAspect="1"/>
+                    </pic:cNvPicPr>
+                  </pic:nvPicPr>
+                  <pic:blipFill>
+                    <a:blip r:embed="rId9"/>
+                    <a:stretch>
+                      <a:fillRect/>
+                    </a:stretch>
+                  </pic:blipFill>
+                  <pic:spPr>
+                    <a:xfrm>
+                      <a:off x="0" y="0"/>
+                      <a:ext cx="5267960" cy="2808605"/>
+                    </a:xfrm>
+                    <a:prstGeom prst="rect">
+                      <a:avLst/>
+                    </a:prstGeom>
+                    <a:noFill/>
+                    <a:ln>
+                      <a:noFill/>
+                    </a:ln>
+                  </pic:spPr>
+                </pic:pic>
+              </a:graphicData>
+            </a:graphic>
+          </wp:inline>
+        </w:drawing>
+      </w:r>
+    </w:p>
+    <w:p>
+      <w:pPr>
+        <w:jc w:val="both"/>
+        <w:rPr>
+          <w:rFonts w:hint="default" w:ascii="Times New Roman" w:hAnsi="Times New Roman" w:cs="Times New Roman"/>
+          <w:sz w:val="26"/>
+          <w:szCs w:val="26"/>
+          <w:lang w:val="en-US"/>
+        </w:rPr>
+      </w:pPr>
+      <w:r>
+        <w:rPr>
+          <w:rFonts w:hint="default" w:ascii="Times New Roman" w:hAnsi="Times New Roman" w:cs="Times New Roman"/>
+          <w:sz w:val="26"/>
+          <w:szCs w:val="26"/>
+          <w:lang w:val="en-US"/>
+        </w:rPr>
+        <w:t>Bài toán 2:</w:t>
+      </w:r>
+    </w:p>
+    <w:p>
+      <w:pPr>
+        <w:jc w:val="both"/>
+      </w:pPr>
+      <w:r>
+        <w:drawing>
+          <wp:inline distT="0" distB="0" distL="114300" distR="114300">
+            <wp:extent cx="3345180" cy="5623560"/>
+            <wp:effectExtent l="0" t="0" r="7620" b="0"/>
+            <wp:docPr id="6" name="Picture 5"/>
+            <wp:cNvGraphicFramePr>
+              <a:graphicFrameLocks xmlns:a="http://schemas.openxmlformats.org/drawingml/2006/main" noChangeAspect="1"/>
+            </wp:cNvGraphicFramePr>
+            <a:graphic xmlns:a="http://schemas.openxmlformats.org/drawingml/2006/main">
+              <a:graphicData uri="http://schemas.openxmlformats.org/drawingml/2006/picture">
+                <pic:pic xmlns:pic="http://schemas.openxmlformats.org/drawingml/2006/picture">
+                  <pic:nvPicPr>
+                    <pic:cNvPr id="6" name="Picture 5"/>
+                    <pic:cNvPicPr>
+                      <a:picLocks noChangeAspect="1"/>
+                    </pic:cNvPicPr>
+                  </pic:nvPicPr>
+                  <pic:blipFill>
+                    <a:blip r:embed="rId10"/>
+                    <a:stretch>
+                      <a:fillRect/>
+                    </a:stretch>
+                  </pic:blipFill>
+                  <pic:spPr>
+                    <a:xfrm>
+                      <a:off x="0" y="0"/>
+                      <a:ext cx="3345180" cy="5623560"/>
+                    </a:xfrm>
+                    <a:prstGeom prst="rect">
+                      <a:avLst/>
+                    </a:prstGeom>
+                    <a:noFill/>
+                    <a:ln>
+                      <a:noFill/>
+                    </a:ln>
+                  </pic:spPr>
+                </pic:pic>
+              </a:graphicData>
+            </a:graphic>
+          </wp:inline>
+        </w:drawing>
+      </w:r>
+    </w:p>
+    <w:p>
+      <w:pPr>
+        <w:jc w:val="both"/>
+        <w:rPr>
+          <w:rFonts w:hint="default"/>
+          <w:lang w:val="en-US"/>
+        </w:rPr>
+      </w:pPr>
+      <w:r>
+        <w:drawing>
+          <wp:inline distT="0" distB="0" distL="114300" distR="114300">
+            <wp:extent cx="5264150" cy="2778760"/>
+            <wp:effectExtent l="0" t="0" r="8890" b="10160"/>
+            <wp:docPr id="8" name="Picture 7"/>
+            <wp:cNvGraphicFramePr>
+              <a:graphicFrameLocks xmlns:a="http://schemas.openxmlformats.org/drawingml/2006/main" noChangeAspect="1"/>
+            </wp:cNvGraphicFramePr>
+            <a:graphic xmlns:a="http://schemas.openxmlformats.org/drawingml/2006/main">
+              <a:graphicData uri="http://schemas.openxmlformats.org/drawingml/2006/picture">
+                <pic:pic xmlns:pic="http://schemas.openxmlformats.org/drawingml/2006/picture">
+                  <pic:nvPicPr>
+                    <pic:cNvPr id="8" name="Picture 7"/>
+                    <pic:cNvPicPr>
+                      <a:picLocks noChangeAspect="1"/>
+                    </pic:cNvPicPr>
+                  </pic:nvPicPr>
+                  <pic:blipFill>
+                    <a:blip r:embed="rId11"/>
+                    <a:stretch>
+                      <a:fillRect/>
+                    </a:stretch>
+                  </pic:blipFill>
+                  <pic:spPr>
+                    <a:xfrm>
+                      <a:off x="0" y="0"/>
+                      <a:ext cx="5264150" cy="2778760"/>
                     </a:xfrm>
                     <a:prstGeom prst="rect">
                       <a:avLst/>

</xml_diff>

<commit_message>
[TUAN03] add: adapter pattern for data conversion
</commit_message>
<xml_diff>
--- a/22660241_NguyenTrungHau_Tuan03/DesignPatterns_Tuan03_22660241_NguyenTrungHau/MinhChung_KTTKPM_Tuan03_22660241_NguyenTrungHau.docx
+++ b/22660241_NguyenTrungHau_Tuan03/DesignPatterns_Tuan03_22660241_NguyenTrungHau/MinhChung_KTTKPM_Tuan03_22660241_NguyenTrungHau.docx
@@ -316,12 +316,6 @@
     <w:p>
       <w:pPr>
         <w:jc w:val="both"/>
-        <w:rPr>
-          <w:rFonts w:hint="default" w:ascii="Times New Roman" w:hAnsi="Times New Roman" w:cs="Times New Roman"/>
-          <w:sz w:val="26"/>
-          <w:szCs w:val="26"/>
-          <w:lang w:val="en-US"/>
-        </w:rPr>
       </w:pPr>
       <w:r>
         <w:rPr>
@@ -342,14 +336,102 @@
         <w:br w:type="textWrapping"/>
       </w:r>
       <w:r>
-        <w:rPr>
-          <w:rFonts w:hint="default" w:ascii="Times New Roman" w:hAnsi="Times New Roman" w:cs="Times New Roman"/>
-          <w:sz w:val="26"/>
-          <w:szCs w:val="26"/>
-          <w:lang w:val="en-US"/>
-        </w:rPr>
-        <w:t>Bài toán 1:</w:t>
-      </w:r>
+        <w:drawing>
+          <wp:inline distT="0" distB="0" distL="114300" distR="114300">
+            <wp:extent cx="5271770" cy="4114800"/>
+            <wp:effectExtent l="0" t="0" r="1270" b="0"/>
+            <wp:docPr id="9" name="Picture 1"/>
+            <wp:cNvGraphicFramePr>
+              <a:graphicFrameLocks xmlns:a="http://schemas.openxmlformats.org/drawingml/2006/main" noChangeAspect="1"/>
+            </wp:cNvGraphicFramePr>
+            <a:graphic xmlns:a="http://schemas.openxmlformats.org/drawingml/2006/main">
+              <a:graphicData uri="http://schemas.openxmlformats.org/drawingml/2006/picture">
+                <pic:pic xmlns:pic="http://schemas.openxmlformats.org/drawingml/2006/picture">
+                  <pic:nvPicPr>
+                    <pic:cNvPr id="9" name="Picture 1"/>
+                    <pic:cNvPicPr>
+                      <a:picLocks noChangeAspect="1"/>
+                    </pic:cNvPicPr>
+                  </pic:nvPicPr>
+                  <pic:blipFill>
+                    <a:blip r:embed="rId8"/>
+                    <a:stretch>
+                      <a:fillRect/>
+                    </a:stretch>
+                  </pic:blipFill>
+                  <pic:spPr>
+                    <a:xfrm>
+                      <a:off x="0" y="0"/>
+                      <a:ext cx="5271770" cy="4114800"/>
+                    </a:xfrm>
+                    <a:prstGeom prst="rect">
+                      <a:avLst/>
+                    </a:prstGeom>
+                    <a:noFill/>
+                    <a:ln>
+                      <a:noFill/>
+                    </a:ln>
+                  </pic:spPr>
+                </pic:pic>
+              </a:graphicData>
+            </a:graphic>
+          </wp:inline>
+        </w:drawing>
+      </w:r>
+    </w:p>
+    <w:p>
+      <w:pPr>
+        <w:jc w:val="both"/>
+        <w:rPr>
+          <w:rFonts w:hint="default"/>
+          <w:lang w:val="en-US"/>
+        </w:rPr>
+      </w:pPr>
+      <w:r>
+        <w:drawing>
+          <wp:inline distT="0" distB="0" distL="114300" distR="114300">
+            <wp:extent cx="5264150" cy="2959735"/>
+            <wp:effectExtent l="0" t="0" r="8890" b="12065"/>
+            <wp:docPr id="10" name="Picture 2"/>
+            <wp:cNvGraphicFramePr>
+              <a:graphicFrameLocks xmlns:a="http://schemas.openxmlformats.org/drawingml/2006/main" noChangeAspect="1"/>
+            </wp:cNvGraphicFramePr>
+            <a:graphic xmlns:a="http://schemas.openxmlformats.org/drawingml/2006/main">
+              <a:graphicData uri="http://schemas.openxmlformats.org/drawingml/2006/picture">
+                <pic:pic xmlns:pic="http://schemas.openxmlformats.org/drawingml/2006/picture">
+                  <pic:nvPicPr>
+                    <pic:cNvPr id="10" name="Picture 2"/>
+                    <pic:cNvPicPr>
+                      <a:picLocks noChangeAspect="1"/>
+                    </pic:cNvPicPr>
+                  </pic:nvPicPr>
+                  <pic:blipFill>
+                    <a:blip r:embed="rId9"/>
+                    <a:stretch>
+                      <a:fillRect/>
+                    </a:stretch>
+                  </pic:blipFill>
+                  <pic:spPr>
+                    <a:xfrm>
+                      <a:off x="0" y="0"/>
+                      <a:ext cx="5264150" cy="2959735"/>
+                    </a:xfrm>
+                    <a:prstGeom prst="rect">
+                      <a:avLst/>
+                    </a:prstGeom>
+                    <a:noFill/>
+                    <a:ln>
+                      <a:noFill/>
+                    </a:ln>
+                  </pic:spPr>
+                </pic:pic>
+              </a:graphicData>
+            </a:graphic>
+          </wp:inline>
+        </w:drawing>
+      </w:r>
+      <w:bookmarkStart w:id="0" w:name="_GoBack"/>
+      <w:bookmarkEnd w:id="0"/>
     </w:p>
     <w:p>
       <w:pPr>
@@ -374,7 +456,7 @@
                     </pic:cNvPicPr>
                   </pic:nvPicPr>
                   <pic:blipFill>
-                    <a:blip r:embed="rId8"/>
+                    <a:blip r:embed="rId10"/>
                     <a:stretch>
                       <a:fillRect/>
                     </a:stretch>
@@ -422,7 +504,7 @@
                     </pic:cNvPicPr>
                   </pic:nvPicPr>
                   <pic:blipFill>
-                    <a:blip r:embed="rId9"/>
+                    <a:blip r:embed="rId11"/>
                     <a:stretch>
                       <a:fillRect/>
                     </a:stretch>
@@ -490,7 +572,7 @@
                     </pic:cNvPicPr>
                   </pic:nvPicPr>
                   <pic:blipFill>
-                    <a:blip r:embed="rId10"/>
+                    <a:blip r:embed="rId12"/>
                     <a:stretch>
                       <a:fillRect/>
                     </a:stretch>
@@ -542,7 +624,7 @@
                     </pic:cNvPicPr>
                   </pic:nvPicPr>
                   <pic:blipFill>
-                    <a:blip r:embed="rId11"/>
+                    <a:blip r:embed="rId13"/>
                     <a:stretch>
                       <a:fillRect/>
                     </a:stretch>
@@ -566,8 +648,6 @@
           </wp:inline>
         </w:drawing>
       </w:r>
-      <w:bookmarkStart w:id="0" w:name="_GoBack"/>
-      <w:bookmarkEnd w:id="0"/>
     </w:p>
     <w:sectPr>
       <w:pgSz w:w="11906" w:h="16838"/>

</xml_diff>

<commit_message>
[TUAN03] add: using pattern for library system
</commit_message>
<xml_diff>
--- a/22660241_NguyenTrungHau_Tuan03/DesignPatterns_Tuan03_22660241_NguyenTrungHau/MinhChung_KTTKPM_Tuan03_22660241_NguyenTrungHau.docx
+++ b/22660241_NguyenTrungHau_Tuan03/DesignPatterns_Tuan03_22660241_NguyenTrungHau/MinhChung_KTTKPM_Tuan03_22660241_NguyenTrungHau.docx
@@ -430,8 +430,6 @@
           </wp:inline>
         </w:drawing>
       </w:r>
-      <w:bookmarkStart w:id="0" w:name="_GoBack"/>
-      <w:bookmarkEnd w:id="0"/>
     </w:p>
     <w:p>
       <w:pPr>
@@ -600,10 +598,6 @@
     <w:p>
       <w:pPr>
         <w:jc w:val="both"/>
-        <w:rPr>
-          <w:rFonts w:hint="default"/>
-          <w:lang w:val="en-US"/>
-        </w:rPr>
       </w:pPr>
       <w:r>
         <w:drawing>
@@ -648,6 +642,144 @@
           </wp:inline>
         </w:drawing>
       </w:r>
+    </w:p>
+    <w:p>
+      <w:pPr>
+        <w:jc w:val="both"/>
+      </w:pPr>
+    </w:p>
+    <w:p>
+      <w:pPr>
+        <w:jc w:val="both"/>
+        <w:rPr>
+          <w:rFonts w:hint="default" w:ascii="Times New Roman" w:hAnsi="Times New Roman" w:cs="Times New Roman"/>
+          <w:sz w:val="26"/>
+          <w:szCs w:val="26"/>
+          <w:lang w:val="en-US"/>
+        </w:rPr>
+      </w:pPr>
+    </w:p>
+    <w:p>
+      <w:pPr>
+        <w:jc w:val="both"/>
+        <w:rPr>
+          <w:rFonts w:hint="default" w:ascii="Times New Roman" w:hAnsi="Times New Roman" w:cs="Times New Roman"/>
+          <w:sz w:val="26"/>
+          <w:szCs w:val="26"/>
+          <w:lang w:val="en-US"/>
+        </w:rPr>
+      </w:pPr>
+      <w:r>
+        <w:rPr>
+          <w:rFonts w:hint="default" w:ascii="Times New Roman" w:hAnsi="Times New Roman" w:cs="Times New Roman"/>
+          <w:sz w:val="26"/>
+          <w:szCs w:val="26"/>
+          <w:lang w:val="en-US"/>
+        </w:rPr>
+        <w:t>Library management:</w:t>
+      </w:r>
+    </w:p>
+    <w:p>
+      <w:pPr>
+        <w:jc w:val="both"/>
+      </w:pPr>
+      <w:r>
+        <w:drawing>
+          <wp:inline distT="0" distB="0" distL="114300" distR="114300">
+            <wp:extent cx="5262245" cy="2554605"/>
+            <wp:effectExtent l="0" t="0" r="10795" b="5715"/>
+            <wp:docPr id="11" name="Picture 3"/>
+            <wp:cNvGraphicFramePr>
+              <a:graphicFrameLocks xmlns:a="http://schemas.openxmlformats.org/drawingml/2006/main" noChangeAspect="1"/>
+            </wp:cNvGraphicFramePr>
+            <a:graphic xmlns:a="http://schemas.openxmlformats.org/drawingml/2006/main">
+              <a:graphicData uri="http://schemas.openxmlformats.org/drawingml/2006/picture">
+                <pic:pic xmlns:pic="http://schemas.openxmlformats.org/drawingml/2006/picture">
+                  <pic:nvPicPr>
+                    <pic:cNvPr id="11" name="Picture 3"/>
+                    <pic:cNvPicPr>
+                      <a:picLocks noChangeAspect="1"/>
+                    </pic:cNvPicPr>
+                  </pic:nvPicPr>
+                  <pic:blipFill>
+                    <a:blip r:embed="rId14"/>
+                    <a:stretch>
+                      <a:fillRect/>
+                    </a:stretch>
+                  </pic:blipFill>
+                  <pic:spPr>
+                    <a:xfrm>
+                      <a:off x="0" y="0"/>
+                      <a:ext cx="5262245" cy="2554605"/>
+                    </a:xfrm>
+                    <a:prstGeom prst="rect">
+                      <a:avLst/>
+                    </a:prstGeom>
+                    <a:noFill/>
+                    <a:ln>
+                      <a:noFill/>
+                    </a:ln>
+                  </pic:spPr>
+                </pic:pic>
+              </a:graphicData>
+            </a:graphic>
+          </wp:inline>
+        </w:drawing>
+      </w:r>
+    </w:p>
+    <w:p>
+      <w:pPr>
+        <w:jc w:val="both"/>
+        <w:rPr>
+          <w:rFonts w:hint="default"/>
+          <w:lang w:val="en-US"/>
+        </w:rPr>
+      </w:pPr>
+      <w:r>
+        <w:drawing>
+          <wp:inline distT="0" distB="0" distL="114300" distR="114300">
+            <wp:extent cx="5267960" cy="2976245"/>
+            <wp:effectExtent l="0" t="0" r="5080" b="10795"/>
+            <wp:docPr id="12" name="Picture 4"/>
+            <wp:cNvGraphicFramePr>
+              <a:graphicFrameLocks xmlns:a="http://schemas.openxmlformats.org/drawingml/2006/main" noChangeAspect="1"/>
+            </wp:cNvGraphicFramePr>
+            <a:graphic xmlns:a="http://schemas.openxmlformats.org/drawingml/2006/main">
+              <a:graphicData uri="http://schemas.openxmlformats.org/drawingml/2006/picture">
+                <pic:pic xmlns:pic="http://schemas.openxmlformats.org/drawingml/2006/picture">
+                  <pic:nvPicPr>
+                    <pic:cNvPr id="12" name="Picture 4"/>
+                    <pic:cNvPicPr>
+                      <a:picLocks noChangeAspect="1"/>
+                    </pic:cNvPicPr>
+                  </pic:nvPicPr>
+                  <pic:blipFill>
+                    <a:blip r:embed="rId15"/>
+                    <a:stretch>
+                      <a:fillRect/>
+                    </a:stretch>
+                  </pic:blipFill>
+                  <pic:spPr>
+                    <a:xfrm>
+                      <a:off x="0" y="0"/>
+                      <a:ext cx="5267960" cy="2976245"/>
+                    </a:xfrm>
+                    <a:prstGeom prst="rect">
+                      <a:avLst/>
+                    </a:prstGeom>
+                    <a:noFill/>
+                    <a:ln>
+                      <a:noFill/>
+                    </a:ln>
+                  </pic:spPr>
+                </pic:pic>
+              </a:graphicData>
+            </a:graphic>
+          </wp:inline>
+        </w:drawing>
+      </w:r>
+      <w:bookmarkStart w:id="0" w:name="_GoBack"/>
+      <w:bookmarkEnd w:id="0"/>
     </w:p>
     <w:sectPr>
       <w:pgSz w:w="11906" w:h="16838"/>

</xml_diff>